<commit_message>
Added mounting holes to Sortimo 1/2 rack. Updated Adam note.
</commit_message>
<xml_diff>
--- a/Savage Note.docx
+++ b/Savage Note.docx
@@ -14,58 +14,151 @@
     </w:p>
     <w:p>
       <w:r>
+        <w:t xml:space="preserve">These boxes and sorter cups ARE </w:t>
+      </w:r>
+      <w:proofErr w:type="spellStart"/>
+      <w:r>
+        <w:t>Sortimo</w:t>
+      </w:r>
+      <w:proofErr w:type="spellEnd"/>
+      <w:r>
+        <w:t xml:space="preserve"> compatible</w:t>
+      </w:r>
+      <w:r>
+        <w:t>, but you’ll</w:t>
+      </w:r>
+      <w:r>
+        <w:t xml:space="preserve"> notice they aren’t clones. </w:t>
+      </w:r>
+      <w:r>
+        <w:t>My design is</w:t>
+      </w:r>
+      <w:r>
+        <w:t xml:space="preserve"> optimized for printability and stacking while maintaining </w:t>
+      </w:r>
+      <w:proofErr w:type="spellStart"/>
+      <w:r>
+        <w:t>Sortimo</w:t>
+      </w:r>
+      <w:proofErr w:type="spellEnd"/>
+      <w:r>
+        <w:t xml:space="preserve"> fitment.</w:t>
+      </w:r>
+      <w:r>
+        <w:t xml:space="preserve"> These have become my go to cups now and all my workspaces are littered with them. </w:t>
+      </w:r>
+    </w:p>
+    <w:p>
+      <w:r>
         <w:t xml:space="preserve">I have to </w:t>
       </w:r>
       <w:r>
         <w:t>say</w:t>
       </w:r>
       <w:r>
-        <w:t xml:space="preserve"> when I saw the “Adam Finds His Bearings” videos my heart just SANK. It was pretty clear that Ron had developed a very similar system to mine, but</w:t>
-      </w:r>
-      <w:r>
-        <w:t xml:space="preserve"> with nice clear lids and</w:t>
-      </w:r>
-      <w:r>
-        <w:t xml:space="preserve"> his is </w:t>
+        <w:t xml:space="preserve"> when I saw the “Adam Finds His Bearings” videos my heart just SANK. It was pretty clear that Ron had developed a </w:t>
+      </w:r>
+      <w:r>
+        <w:t>VERY</w:t>
+      </w:r>
+      <w:r>
+        <w:t xml:space="preserve"> similar </w:t>
       </w:r>
       <w:proofErr w:type="spellStart"/>
       <w:r>
-        <w:t>Sort</w:t>
-      </w:r>
-      <w:r>
-        <w:t>i</w:t>
-      </w:r>
-      <w:r>
-        <w:t>mo</w:t>
+        <w:t>Sortimo</w:t>
       </w:r>
       <w:proofErr w:type="spellEnd"/>
       <w:r>
-        <w:t xml:space="preserve"> compatible</w:t>
-      </w:r>
-      <w:r>
-        <w:t xml:space="preserve"> to boot</w:t>
-      </w:r>
-      <w:r>
-        <w:t>, so obviously a better fit for you and your cave.</w:t>
-      </w:r>
-    </w:p>
-    <w:p>
-      <w:r>
-        <w:t>But I was already excited to send these</w:t>
+        <w:t xml:space="preserve"> box to what I’d been tweaking for a long time,</w:t>
+      </w:r>
+      <w:r>
+        <w:t xml:space="preserve"> but</w:t>
+      </w:r>
+      <w:r>
+        <w:t xml:space="preserve"> with nice clear lids</w:t>
+      </w:r>
+      <w:r>
+        <w:t xml:space="preserve"> to boot.</w:t>
+      </w:r>
+      <w:r>
+        <w:t xml:space="preserve"> I couldn’t believe he beat me to sending you one, but I hope you like mine anyway.</w:t>
+      </w:r>
+    </w:p>
+    <w:p>
+      <w:r>
+        <w:t>I was already excited to send these</w:t>
       </w:r>
       <w:r>
         <w:t xml:space="preserve"> sorters</w:t>
       </w:r>
       <w:r>
-        <w:t xml:space="preserve"> your way before the bearings video went up so </w:t>
+        <w:t xml:space="preserve"> your way before the bearings video went up</w:t>
+      </w:r>
+      <w:r>
+        <w:t>,</w:t>
+      </w:r>
+      <w:r>
+        <w:t xml:space="preserve"> so</w:t>
+      </w:r>
+      <w:r>
+        <w:t xml:space="preserve"> I’m not letting that bring me down and I’m sending them anyway</w:t>
+      </w:r>
+      <w:r>
+        <w:t>.</w:t>
+      </w:r>
+      <w:r>
+        <w:t xml:space="preserve"> My system is a </w:t>
+      </w:r>
+      <w:r>
+        <w:t>little</w:t>
+      </w:r>
+      <w:r>
+        <w:t xml:space="preserve"> different after all.</w:t>
+      </w:r>
+    </w:p>
+    <w:p>
+      <w:r>
+        <w:t xml:space="preserve">I’m sure it’s obvious where the </w:t>
+      </w:r>
+      <w:r>
+        <w:t>inspiration for the rack came from</w:t>
+      </w:r>
+      <w:r>
+        <w:t xml:space="preserve"> </w:t>
       </w:r>
       <w:proofErr w:type="gramStart"/>
       <w:r>
-        <w:t>here</w:t>
+        <w:t>:-)</w:t>
+      </w:r>
+      <w:r>
+        <w:t xml:space="preserve">  </w:t>
+      </w:r>
+      <w:r>
+        <w:t>The</w:t>
       </w:r>
       <w:proofErr w:type="gramEnd"/>
       <w:r>
-        <w:t xml:space="preserve"> they are.</w:t>
+        <w:t xml:space="preserve"> original rack design was just cubbies, but after you built your new </w:t>
+      </w:r>
+      <w:proofErr w:type="spellStart"/>
+      <w:r>
+        <w:t>Sortimo</w:t>
+      </w:r>
+      <w:proofErr w:type="spellEnd"/>
+      <w:r>
+        <w:t xml:space="preserve"> racks I just had to add drawer slides. There is a version for 4.5mm ball bearings, and a version for .177 </w:t>
+      </w:r>
+      <w:proofErr w:type="spellStart"/>
+      <w:r>
+        <w:t>cal</w:t>
+      </w:r>
+      <w:proofErr w:type="spellEnd"/>
+      <w:r>
+        <w:t xml:space="preserve"> BBs for those doing it on the cheap. Drawer slides might be overkill for such a small sorter, but after using them for a while I</w:t>
+      </w:r>
+      <w:r>
+        <w:t xml:space="preserve"> do prefer them over simple cubbies. </w:t>
       </w:r>
     </w:p>
     <w:p>
@@ -79,7 +172,21 @@
         <w:t>also included, so hopefully you can use that same sacrificial PC you used to get Ron’s files if you want them</w:t>
       </w:r>
       <w:r>
-        <w:t xml:space="preserve"> (or I’m happy to email them JaredAinsworth@gmail.com)</w:t>
+        <w:t xml:space="preserve"> (or I’m happy to email them </w:t>
+      </w:r>
+      <w:hyperlink r:id="rId4" w:history="1">
+        <w:r>
+          <w:rPr>
+            <w:rStyle w:val="Hyperlink"/>
+          </w:rPr>
+          <w:t>JaredAinsworth@gmail.com</w:t>
+        </w:r>
+      </w:hyperlink>
+      <w:r>
+        <w:t>)</w:t>
+      </w:r>
+      <w:r>
+        <w:t>, or give you access to my GIT repo so you can always get the latest version</w:t>
       </w:r>
       <w:r>
         <w:t>.</w:t>
@@ -87,42 +194,38 @@
     </w:p>
     <w:p>
       <w:r>
-        <w:t>The 6x5 sorter box is the largest size that you can print on the X1-Carbon. And the rack actually fits too.</w:t>
-      </w:r>
-    </w:p>
-    <w:p>
-      <w:r>
-        <w:t xml:space="preserve">The original rack design was just cubbies, but after you built your new </w:t>
-      </w:r>
-      <w:proofErr w:type="spellStart"/>
-      <w:r>
-        <w:t>Sortimo</w:t>
-      </w:r>
-      <w:proofErr w:type="spellEnd"/>
-      <w:r>
-        <w:t xml:space="preserve"> racks I just had to add drawer slides. There is a version for 4.5mm ball bearings, and a version for .177 </w:t>
-      </w:r>
-      <w:proofErr w:type="spellStart"/>
-      <w:r>
-        <w:t>cal</w:t>
-      </w:r>
-      <w:proofErr w:type="spellEnd"/>
-      <w:r>
-        <w:t xml:space="preserve"> BBs for those doing it on the cheap. </w:t>
-      </w:r>
-      <w:r>
-        <w:t>Drawer slides might be overkill for such a small sorter, but after using them for a while I do prefer them.</w:t>
-      </w:r>
-    </w:p>
-    <w:p>
-      <w:r>
-        <w:t xml:space="preserve">The boxes are designed around M3 hardware, but 3D printable pins with e-clips are also included for a fully 3D printable design. </w:t>
+        <w:t xml:space="preserve">The </w:t>
+      </w:r>
+      <w:r>
+        <w:t>4x4</w:t>
+      </w:r>
+      <w:r>
+        <w:t xml:space="preserve"> sorter box is the largest size that you can print on the X1-Carbon</w:t>
+      </w:r>
+      <w:r>
+        <w:t xml:space="preserve">. Everything here is printed on X1-Carbon printers. All printed in ABS. </w:t>
+      </w:r>
+    </w:p>
+    <w:p>
+      <w:r>
+        <w:t>The boxes are designed around M3 hardware, but 3D printable pins with e-clips are also included for a fully 3D printable design</w:t>
+      </w:r>
+      <w:r>
+        <w:t xml:space="preserve"> (racks REQUIRE some M3 hardware &amp; ball bearings).</w:t>
       </w:r>
     </w:p>
     <w:p/>
     <w:p>
       <w:r>
-        <w:t>Thanks again for everything,</w:t>
+        <w:t>I hope you and your team like them.</w:t>
+      </w:r>
+    </w:p>
+    <w:p>
+      <w:r>
+        <w:t>Thanks again for everything</w:t>
+      </w:r>
+      <w:r>
+        <w:t>,</w:t>
       </w:r>
     </w:p>
     <w:p/>
@@ -569,6 +672,29 @@
     <w:semiHidden/>
     <w:unhideWhenUsed/>
   </w:style>
+  <w:style w:type="character" w:styleId="Hyperlink">
+    <w:name w:val="Hyperlink"/>
+    <w:basedOn w:val="DefaultParagraphFont"/>
+    <w:uiPriority w:val="99"/>
+    <w:unhideWhenUsed/>
+    <w:rsid w:val="006474A6"/>
+    <w:rPr>
+      <w:color w:val="0563C1" w:themeColor="hyperlink"/>
+      <w:u w:val="single"/>
+    </w:rPr>
+  </w:style>
+  <w:style w:type="character" w:styleId="UnresolvedMention">
+    <w:name w:val="Unresolved Mention"/>
+    <w:basedOn w:val="DefaultParagraphFont"/>
+    <w:uiPriority w:val="99"/>
+    <w:semiHidden/>
+    <w:unhideWhenUsed/>
+    <w:rsid w:val="006474A6"/>
+    <w:rPr>
+      <w:color w:val="605E5C"/>
+      <w:shd w:val="clear" w:color="auto" w:fill="E1DFDD"/>
+    </w:rPr>
+  </w:style>
 </w:styles>
 </file>
 

</xml_diff>

<commit_message>
Letter update. Config cleanups.
</commit_message>
<xml_diff>
--- a/Savage Note.docx
+++ b/Savage Note.docx
@@ -1,167 +1,203 @@
 
 <file path=word/document.xml><?xml version="1.0" encoding="utf-8"?>
-<w:document xmlns:wpc="http://schemas.microsoft.com/office/word/2010/wordprocessingCanvas" xmlns:cx="http://schemas.microsoft.com/office/drawing/2014/chartex" xmlns:cx1="http://schemas.microsoft.com/office/drawing/2015/9/8/chartex" xmlns:cx2="http://schemas.microsoft.com/office/drawing/2015/10/21/chartex" xmlns:cx3="http://schemas.microsoft.com/office/drawing/2016/5/9/chartex" xmlns:cx4="http://schemas.microsoft.com/office/drawing/2016/5/10/chartex" xmlns:cx5="http://schemas.microsoft.com/office/drawing/2016/5/11/chartex" xmlns:cx6="http://schemas.microsoft.com/office/drawing/2016/5/12/chartex" xmlns:cx7="http://schemas.microsoft.com/office/drawing/2016/5/13/chartex" xmlns:cx8="http://schemas.microsoft.com/office/drawing/2016/5/14/chartex" xmlns:mc="http://schemas.openxmlformats.org/markup-compatibility/2006" xmlns:aink="http://schemas.microsoft.com/office/drawing/2016/ink" xmlns:am3d="http://schemas.microsoft.com/office/drawing/2017/model3d" xmlns:o="urn:schemas-microsoft-com:office:office" xmlns:oel="http://schemas.microsoft.com/office/2019/extlst" xmlns:r="http://schemas.openxmlformats.org/officeDocument/2006/relationships" xmlns:m="http://schemas.openxmlformats.org/officeDocument/2006/math" xmlns:v="urn:schemas-microsoft-com:vml" xmlns:wp14="http://schemas.microsoft.com/office/word/2010/wordprocessingDrawing" xmlns:wp="http://schemas.openxmlformats.org/drawingml/2006/wordprocessingDrawing" xmlns:w10="urn:schemas-microsoft-com:office:word" xmlns:w="http://schemas.openxmlformats.org/wordprocessingml/2006/main" xmlns:w14="http://schemas.microsoft.com/office/word/2010/wordml" xmlns:w15="http://schemas.microsoft.com/office/word/2012/wordml" xmlns:w16cex="http://schemas.microsoft.com/office/word/2018/wordml/cex" xmlns:w16cid="http://schemas.microsoft.com/office/word/2016/wordml/cid" xmlns:w16="http://schemas.microsoft.com/office/word/2018/wordml" xmlns:w16du="http://schemas.microsoft.com/office/word/2023/wordml/word16du" xmlns:w16sdtdh="http://schemas.microsoft.com/office/word/2020/wordml/sdtdatahash" xmlns:w16se="http://schemas.microsoft.com/office/word/2015/wordml/symex" xmlns:wpg="http://schemas.microsoft.com/office/word/2010/wordprocessingGroup" xmlns:wpi="http://schemas.microsoft.com/office/word/2010/wordprocessingInk" xmlns:wne="http://schemas.microsoft.com/office/word/2006/wordml" xmlns:wps="http://schemas.microsoft.com/office/word/2010/wordprocessingShape" mc:Ignorable="w14 w15 w16se w16cid w16 w16cex w16sdtdh w16du wp14">
+<w:document xmlns:wpc="http://schemas.microsoft.com/office/word/2010/wordprocessingCanvas" xmlns:cx="http://schemas.microsoft.com/office/drawing/2014/chartex" xmlns:cx1="http://schemas.microsoft.com/office/drawing/2015/9/8/chartex" xmlns:cx2="http://schemas.microsoft.com/office/drawing/2015/10/21/chartex" xmlns:cx3="http://schemas.microsoft.com/office/drawing/2016/5/9/chartex" xmlns:cx4="http://schemas.microsoft.com/office/drawing/2016/5/10/chartex" xmlns:cx5="http://schemas.microsoft.com/office/drawing/2016/5/11/chartex" xmlns:cx6="http://schemas.microsoft.com/office/drawing/2016/5/12/chartex" xmlns:cx7="http://schemas.microsoft.com/office/drawing/2016/5/13/chartex" xmlns:cx8="http://schemas.microsoft.com/office/drawing/2016/5/14/chartex" xmlns:mc="http://schemas.openxmlformats.org/markup-compatibility/2006" xmlns:aink="http://schemas.microsoft.com/office/drawing/2016/ink" xmlns:am3d="http://schemas.microsoft.com/office/drawing/2017/model3d" xmlns:o="urn:schemas-microsoft-com:office:office" xmlns:oel="http://schemas.microsoft.com/office/2019/extlst" xmlns:r="http://schemas.openxmlformats.org/officeDocument/2006/relationships" xmlns:m="http://schemas.openxmlformats.org/officeDocument/2006/math" xmlns:v="urn:schemas-microsoft-com:vml" xmlns:wp14="http://schemas.microsoft.com/office/word/2010/wordprocessingDrawing" xmlns:wp="http://schemas.openxmlformats.org/drawingml/2006/wordprocessingDrawing" xmlns:w10="urn:schemas-microsoft-com:office:word" xmlns:w="http://schemas.openxmlformats.org/wordprocessingml/2006/main" xmlns:w14="http://schemas.microsoft.com/office/word/2010/wordml" xmlns:w15="http://schemas.microsoft.com/office/word/2012/wordml" xmlns:w16cex="http://schemas.microsoft.com/office/word/2018/wordml/cex" xmlns:w16cid="http://schemas.microsoft.com/office/word/2016/wordml/cid" xmlns:w16="http://schemas.microsoft.com/office/word/2018/wordml" xmlns:w16du="http://schemas.microsoft.com/office/word/2023/wordml/word16du" xmlns:w16sdtdh="http://schemas.microsoft.com/office/word/2020/wordml/sdtdatahash" xmlns:w16sdtfl="http://schemas.microsoft.com/office/word/2024/wordml/sdtformatlock" xmlns:w16se="http://schemas.microsoft.com/office/word/2015/wordml/symex" xmlns:wpg="http://schemas.microsoft.com/office/word/2010/wordprocessingGroup" xmlns:wpi="http://schemas.microsoft.com/office/word/2010/wordprocessingInk" xmlns:wne="http://schemas.microsoft.com/office/word/2006/wordml" xmlns:wps="http://schemas.microsoft.com/office/word/2010/wordprocessingShape" mc:Ignorable="w14 w15 w16se w16cid w16 w16cex w16sdtdh w16sdtfl w16du wp14">
   <w:body>
     <w:p>
+      <w:pPr>
+        <w:spacing w:after="0"/>
+      </w:pPr>
       <w:r>
         <w:t>Hi Adam,</w:t>
       </w:r>
     </w:p>
     <w:p>
+      <w:pPr>
+        <w:spacing w:after="0"/>
+      </w:pPr>
+    </w:p>
+    <w:p>
+      <w:pPr>
+        <w:spacing w:after="0"/>
+      </w:pPr>
       <w:r>
         <w:t>Let me start by saying thank you for all the wonderful knowledge you share. I watched MythBusters regularly and the Tested content is great!</w:t>
       </w:r>
     </w:p>
     <w:p>
-      <w:r>
-        <w:t xml:space="preserve">These boxes and sorter cups ARE </w:t>
+      <w:pPr>
+        <w:spacing w:after="0"/>
+      </w:pPr>
+    </w:p>
+    <w:p>
+      <w:pPr>
+        <w:spacing w:after="0"/>
+      </w:pPr>
+      <w:r>
+        <w:t>These</w:t>
+      </w:r>
+      <w:r>
+        <w:t xml:space="preserve"> </w:t>
+      </w:r>
+      <w:r>
+        <w:t>sorter</w:t>
+      </w:r>
+      <w:r>
+        <w:t xml:space="preserve"> boxes and cups ARE Sortimo compatible</w:t>
+      </w:r>
+      <w:r>
+        <w:t>, but you’ll</w:t>
+      </w:r>
+      <w:r>
+        <w:t xml:space="preserve"> notice they aren’t clones. </w:t>
+      </w:r>
+      <w:r>
+        <w:t>My design is</w:t>
+      </w:r>
+      <w:r>
+        <w:t xml:space="preserve"> optimized for printability and stacking while maintaining Sortimo fitment.</w:t>
+      </w:r>
+      <w:r>
+        <w:t xml:space="preserve"> These have become my go to cups now and all my workspaces are littered with </w:t>
+      </w:r>
+      <w:r>
+        <w:t>various sizes</w:t>
+      </w:r>
+      <w:r>
+        <w:t xml:space="preserve"> :-)</w:t>
+      </w:r>
+      <w:r>
+        <w:t xml:space="preserve">. </w:t>
+      </w:r>
+    </w:p>
+    <w:p>
+      <w:pPr>
+        <w:spacing w:after="0"/>
+      </w:pPr>
+    </w:p>
+    <w:p>
+      <w:pPr>
+        <w:spacing w:after="0"/>
+      </w:pPr>
+      <w:r>
+        <w:t xml:space="preserve">I have to </w:t>
+      </w:r>
+      <w:r>
+        <w:t>say</w:t>
+      </w:r>
+      <w:r>
+        <w:t xml:space="preserve"> when I saw the “Adam Finds His Bearings” videos my heart just SANK. It was pretty clear that Ron had developed a </w:t>
+      </w:r>
+      <w:r>
+        <w:t>VERY</w:t>
+      </w:r>
+      <w:r>
+        <w:t xml:space="preserve"> similar </w:t>
+      </w:r>
+      <w:r>
+        <w:t>Sortimo box to what I’</w:t>
+      </w:r>
+      <w:r>
+        <w:t xml:space="preserve">ve </w:t>
+      </w:r>
+      <w:r>
+        <w:t>been tweaking for a long time,</w:t>
+      </w:r>
+      <w:r>
+        <w:t xml:space="preserve"> but</w:t>
+      </w:r>
+      <w:r>
+        <w:t xml:space="preserve"> with nice clear lids</w:t>
+      </w:r>
+      <w:r>
+        <w:t xml:space="preserve"> to boot.</w:t>
+      </w:r>
+      <w:r>
+        <w:t xml:space="preserve"> I couldn’t believe he beat me to sending you one, but I hope you like mine anyway.</w:t>
+      </w:r>
+      <w:r>
+        <w:t xml:space="preserve"> </w:t>
+      </w:r>
+      <w:r>
+        <w:t>I was already excited to send these</w:t>
+      </w:r>
+      <w:r>
+        <w:t xml:space="preserve"> sorters</w:t>
+      </w:r>
+      <w:r>
+        <w:t xml:space="preserve"> your way before the bearings video went up</w:t>
+      </w:r>
+      <w:r>
+        <w:t>,</w:t>
+      </w:r>
+      <w:r>
+        <w:t xml:space="preserve"> so</w:t>
+      </w:r>
+      <w:r>
+        <w:t xml:space="preserve"> I’m not letting that bring me down and I’m sending them anyway</w:t>
+      </w:r>
+      <w:r>
+        <w:t>.</w:t>
+      </w:r>
+      <w:r>
+        <w:t xml:space="preserve"> My system is a </w:t>
+      </w:r>
+      <w:r>
+        <w:t>little</w:t>
+      </w:r>
+      <w:r>
+        <w:t xml:space="preserve"> different after all.</w:t>
+      </w:r>
+    </w:p>
+    <w:p>
+      <w:pPr>
+        <w:spacing w:after="0"/>
+      </w:pPr>
+    </w:p>
+    <w:p>
+      <w:pPr>
+        <w:spacing w:after="0"/>
+      </w:pPr>
+      <w:r>
+        <w:t xml:space="preserve">I’m sure it’s obvious where the </w:t>
+      </w:r>
+      <w:r>
+        <w:t>inspiration for the rack came from</w:t>
+      </w:r>
+      <w:r>
+        <w:t xml:space="preserve"> </w:t>
+      </w:r>
+      <w:proofErr w:type="gramStart"/>
+      <w:r>
+        <w:t>:-)</w:t>
+      </w:r>
+      <w:r>
+        <w:t xml:space="preserve">  </w:t>
+      </w:r>
+      <w:r>
+        <w:t>The</w:t>
+      </w:r>
+      <w:proofErr w:type="gramEnd"/>
+      <w:r>
+        <w:t xml:space="preserve"> original rack design was just cubbies, but after you built your Sortimo racks I just had to add drawer slides. There is a version for 4.5mm ball bearings, and a version for .177 </w:t>
       </w:r>
       <w:proofErr w:type="spellStart"/>
       <w:r>
-        <w:t>Sortimo</w:t>
+        <w:t>cal</w:t>
       </w:r>
       <w:proofErr w:type="spellEnd"/>
       <w:r>
-        <w:t xml:space="preserve"> compatible</w:t>
-      </w:r>
-      <w:r>
-        <w:t>, but you’ll</w:t>
-      </w:r>
-      <w:r>
-        <w:t xml:space="preserve"> notice they aren’t clones. </w:t>
-      </w:r>
-      <w:r>
-        <w:t>My design is</w:t>
-      </w:r>
-      <w:r>
-        <w:t xml:space="preserve"> optimized for printability and stacking while maintaining </w:t>
-      </w:r>
-      <w:proofErr w:type="spellStart"/>
-      <w:r>
-        <w:t>Sortimo</w:t>
-      </w:r>
-      <w:proofErr w:type="spellEnd"/>
-      <w:r>
-        <w:t xml:space="preserve"> fitment.</w:t>
-      </w:r>
-      <w:r>
-        <w:t xml:space="preserve"> These have become my go to cups now and all my workspaces are littered with them. </w:t>
-      </w:r>
-    </w:p>
-    <w:p>
-      <w:r>
-        <w:t xml:space="preserve">I have to </w:t>
-      </w:r>
-      <w:r>
-        <w:t>say</w:t>
-      </w:r>
-      <w:r>
-        <w:t xml:space="preserve"> when I saw the “Adam Finds His Bearings” videos my heart just SANK. It was pretty clear that Ron had developed a </w:t>
-      </w:r>
-      <w:r>
-        <w:t>VERY</w:t>
-      </w:r>
-      <w:r>
-        <w:t xml:space="preserve"> similar </w:t>
-      </w:r>
-      <w:proofErr w:type="spellStart"/>
-      <w:r>
-        <w:t>Sortimo</w:t>
-      </w:r>
-      <w:proofErr w:type="spellEnd"/>
-      <w:r>
-        <w:t xml:space="preserve"> box to what I’d been tweaking for a long time,</w:t>
-      </w:r>
-      <w:r>
-        <w:t xml:space="preserve"> but</w:t>
-      </w:r>
-      <w:r>
-        <w:t xml:space="preserve"> with nice clear lids</w:t>
-      </w:r>
-      <w:r>
-        <w:t xml:space="preserve"> to boot.</w:t>
-      </w:r>
-      <w:r>
-        <w:t xml:space="preserve"> I couldn’t believe he beat me to sending you one, but I hope you like mine anyway.</w:t>
-      </w:r>
-    </w:p>
-    <w:p>
-      <w:r>
-        <w:t>I was already excited to send these</w:t>
-      </w:r>
-      <w:r>
-        <w:t xml:space="preserve"> sorters</w:t>
-      </w:r>
-      <w:r>
-        <w:t xml:space="preserve"> your way before the bearings video went up</w:t>
-      </w:r>
-      <w:r>
-        <w:t>,</w:t>
-      </w:r>
-      <w:r>
-        <w:t xml:space="preserve"> so</w:t>
-      </w:r>
-      <w:r>
-        <w:t xml:space="preserve"> I’m not letting that bring me down and I’m sending them anyway</w:t>
-      </w:r>
-      <w:r>
-        <w:t>.</w:t>
-      </w:r>
-      <w:r>
-        <w:t xml:space="preserve"> My system is a </w:t>
-      </w:r>
-      <w:r>
-        <w:t>little</w:t>
-      </w:r>
-      <w:r>
-        <w:t xml:space="preserve"> different after all.</w:t>
-      </w:r>
-    </w:p>
-    <w:p>
-      <w:r>
-        <w:t xml:space="preserve">I’m sure it’s obvious where the </w:t>
-      </w:r>
-      <w:r>
-        <w:t>inspiration for the rack came from</w:t>
-      </w:r>
-      <w:r>
-        <w:t xml:space="preserve"> </w:t>
-      </w:r>
-      <w:proofErr w:type="gramStart"/>
-      <w:r>
-        <w:t>:-)</w:t>
-      </w:r>
-      <w:r>
-        <w:t xml:space="preserve">  </w:t>
-      </w:r>
-      <w:r>
-        <w:t>The</w:t>
-      </w:r>
-      <w:proofErr w:type="gramEnd"/>
-      <w:r>
-        <w:t xml:space="preserve"> original rack design was just cubbies, but after you built your new </w:t>
-      </w:r>
-      <w:proofErr w:type="spellStart"/>
-      <w:r>
-        <w:t>Sortimo</w:t>
-      </w:r>
-      <w:proofErr w:type="spellEnd"/>
-      <w:r>
-        <w:t xml:space="preserve"> racks I just had to add drawer slides. There is a version for 4.5mm ball bearings, and a version for .177 </w:t>
-      </w:r>
-      <w:proofErr w:type="spellStart"/>
-      <w:r>
-        <w:t>cal</w:t>
-      </w:r>
-      <w:proofErr w:type="spellEnd"/>
-      <w:r>
-        <w:t xml:space="preserve"> BBs for those doing it on the cheap. Drawer slides might be overkill for such a small sorter, but after using them for a while I</w:t>
-      </w:r>
-      <w:r>
-        <w:t xml:space="preserve"> do prefer them over simple cubbies. </w:t>
-      </w:r>
-    </w:p>
-    <w:p>
+        <w:t xml:space="preserve"> BBs for those doing it on the cheap. Drawer slides might be overkill for such a small sorter, but after using them for a while I do prefer them over simple cubbies. </w:t>
+      </w:r>
+    </w:p>
+    <w:p>
+      <w:pPr>
+        <w:spacing w:after="0"/>
+      </w:pPr>
+    </w:p>
+    <w:p>
+      <w:pPr>
+        <w:spacing w:after="0"/>
+      </w:pPr>
       <w:r>
         <w:t xml:space="preserve">Files </w:t>
       </w:r>
@@ -174,7 +210,7 @@
       <w:r>
         <w:t xml:space="preserve"> (or I’m happy to email them </w:t>
       </w:r>
-      <w:hyperlink r:id="rId4" w:history="1">
+      <w:hyperlink r:id="rId5" w:history="1">
         <w:r>
           <w:rPr>
             <w:rStyle w:val="Hyperlink"/>
@@ -191,8 +227,19 @@
       <w:r>
         <w:t>.</w:t>
       </w:r>
-    </w:p>
-    <w:p>
+      <w:r>
+        <w:t xml:space="preserve"> I’m still updating all the time.</w:t>
+      </w:r>
+    </w:p>
+    <w:p>
+      <w:pPr>
+        <w:spacing w:after="0"/>
+      </w:pPr>
+    </w:p>
+    <w:p>
+      <w:pPr>
+        <w:spacing w:after="0"/>
+      </w:pPr>
       <w:r>
         <w:t xml:space="preserve">The </w:t>
       </w:r>
@@ -207,6 +254,14 @@
       </w:r>
     </w:p>
     <w:p>
+      <w:pPr>
+        <w:spacing w:after="0"/>
+      </w:pPr>
+    </w:p>
+    <w:p>
+      <w:pPr>
+        <w:spacing w:after="0"/>
+      </w:pPr>
       <w:r>
         <w:t>The boxes are designed around M3 hardware, but 3D printable pins with e-clips are also included for a fully 3D printable design</w:t>
       </w:r>
@@ -214,13 +269,23 @@
         <w:t xml:space="preserve"> (racks REQUIRE some M3 hardware &amp; ball bearings).</w:t>
       </w:r>
     </w:p>
-    <w:p/>
-    <w:p>
+    <w:p>
+      <w:pPr>
+        <w:spacing w:after="0"/>
+      </w:pPr>
+    </w:p>
+    <w:p>
+      <w:pPr>
+        <w:spacing w:after="0"/>
+      </w:pPr>
       <w:r>
         <w:t>I hope you and your team like them.</w:t>
       </w:r>
     </w:p>
     <w:p>
+      <w:pPr>
+        <w:spacing w:after="0"/>
+      </w:pPr>
       <w:r>
         <w:t>Thanks again for everything</w:t>
       </w:r>
@@ -228,15 +293,123 @@
         <w:t>,</w:t>
       </w:r>
     </w:p>
-    <w:p/>
-    <w:p>
+    <w:p>
+      <w:pPr>
+        <w:spacing w:after="0"/>
+      </w:pPr>
+    </w:p>
+    <w:p>
+      <w:pPr>
+        <w:spacing w:after="0"/>
+      </w:pPr>
       <w:r>
         <w:t>Jared Ainsworth</w:t>
+      </w:r>
+    </w:p>
+    <w:p>
+      <w:pPr>
+        <w:spacing w:after="0"/>
+      </w:pPr>
+    </w:p>
+    <w:p>
+      <w:pPr>
+        <w:spacing w:after="0"/>
+      </w:pPr>
+      <w:r>
+        <w:t xml:space="preserve">P.S. </w:t>
+      </w:r>
+    </w:p>
+    <w:p>
+      <w:pPr>
+        <w:spacing w:after="0"/>
+      </w:pPr>
+      <w:r>
+        <w:t>Sorry, but the boxes aren’t the latest revision. I printed them a while ago and I’m constantly tweaking the design.</w:t>
+      </w:r>
+    </w:p>
+    <w:p>
+      <w:pPr>
+        <w:spacing w:after="0"/>
+      </w:pPr>
+      <w:r>
+        <w:t>Updates missing from your version:</w:t>
+      </w:r>
+    </w:p>
+    <w:p>
+      <w:pPr>
+        <w:pStyle w:val="ListParagraph"/>
+        <w:numPr>
+          <w:ilvl w:val="0"/>
+          <w:numId w:val="1"/>
+        </w:numPr>
+        <w:spacing w:after="0"/>
+      </w:pPr>
+      <w:r>
+        <w:t>Boxes now have a “stopper” to keep the lid from opening more than ~100 degrees.</w:t>
+      </w:r>
+    </w:p>
+    <w:p>
+      <w:pPr>
+        <w:pStyle w:val="ListParagraph"/>
+        <w:numPr>
+          <w:ilvl w:val="0"/>
+          <w:numId w:val="1"/>
+        </w:numPr>
+        <w:spacing w:after="0"/>
+      </w:pPr>
+      <w:r>
+        <w:t>Sortimo cups have snugger “stacking latch bumps” that disconnect easier (was too tight for PLA).</w:t>
+      </w:r>
+    </w:p>
+    <w:p>
+      <w:pPr>
+        <w:pStyle w:val="ListParagraph"/>
+        <w:numPr>
+          <w:ilvl w:val="0"/>
+          <w:numId w:val="1"/>
+        </w:numPr>
+        <w:spacing w:after="0"/>
+      </w:pPr>
+      <w:r>
+        <w:t>O-Ring grooves are a bit deeper so the lid closes better with 2</w:t>
+      </w:r>
+      <w:r>
+        <w:t>.5</w:t>
+      </w:r>
+      <w:r>
+        <w:t>mm silicon foam</w:t>
+      </w:r>
+      <w:r>
+        <w:t xml:space="preserve"> seal</w:t>
+      </w:r>
+      <w:r>
+        <w:t xml:space="preserve"> installed. </w:t>
+      </w:r>
+    </w:p>
+    <w:p>
+      <w:pPr>
+        <w:spacing w:after="0"/>
+      </w:pPr>
+    </w:p>
+    <w:p>
+      <w:pPr>
+        <w:spacing w:after="0"/>
+      </w:pPr>
+      <w:r>
+        <w:t xml:space="preserve">P.P.S. </w:t>
+      </w:r>
+    </w:p>
+    <w:p>
+      <w:pPr>
+        <w:spacing w:after="0"/>
+      </w:pPr>
+      <w:r>
+        <w:t xml:space="preserve">There are also a LOT of different sizes of the box included in the files. Makes for great small project boxes. </w:t>
       </w:r>
     </w:p>
     <w:sectPr>
       <w:pgSz w:w="12240" w:h="15840"/>
-      <w:pgMar w:top="1440" w:right="1440" w:bottom="1440" w:left="1440" w:header="720" w:footer="720" w:gutter="0"/>
+      <w:pgMar w:top="1440" w:right="1080" w:bottom="1440" w:left="1080" w:header="720" w:footer="720" w:gutter="0"/>
       <w:cols w:space="720"/>
       <w:docGrid w:linePitch="360"/>
     </w:sectPr>
@@ -244,8 +417,129 @@
 </w:document>
 </file>
 
+<file path=word/numbering.xml><?xml version="1.0" encoding="utf-8"?>
+<w:numbering xmlns:wpc="http://schemas.microsoft.com/office/word/2010/wordprocessingCanvas" xmlns:cx="http://schemas.microsoft.com/office/drawing/2014/chartex" xmlns:cx1="http://schemas.microsoft.com/office/drawing/2015/9/8/chartex" xmlns:cx2="http://schemas.microsoft.com/office/drawing/2015/10/21/chartex" xmlns:cx3="http://schemas.microsoft.com/office/drawing/2016/5/9/chartex" xmlns:cx4="http://schemas.microsoft.com/office/drawing/2016/5/10/chartex" xmlns:cx5="http://schemas.microsoft.com/office/drawing/2016/5/11/chartex" xmlns:cx6="http://schemas.microsoft.com/office/drawing/2016/5/12/chartex" xmlns:cx7="http://schemas.microsoft.com/office/drawing/2016/5/13/chartex" xmlns:cx8="http://schemas.microsoft.com/office/drawing/2016/5/14/chartex" xmlns:mc="http://schemas.openxmlformats.org/markup-compatibility/2006" xmlns:aink="http://schemas.microsoft.com/office/drawing/2016/ink" xmlns:am3d="http://schemas.microsoft.com/office/drawing/2017/model3d" xmlns:o="urn:schemas-microsoft-com:office:office" xmlns:oel="http://schemas.microsoft.com/office/2019/extlst" xmlns:r="http://schemas.openxmlformats.org/officeDocument/2006/relationships" xmlns:m="http://schemas.openxmlformats.org/officeDocument/2006/math" xmlns:v="urn:schemas-microsoft-com:vml" xmlns:wp14="http://schemas.microsoft.com/office/word/2010/wordprocessingDrawing" xmlns:wp="http://schemas.openxmlformats.org/drawingml/2006/wordprocessingDrawing" xmlns:w10="urn:schemas-microsoft-com:office:word" xmlns:w="http://schemas.openxmlformats.org/wordprocessingml/2006/main" xmlns:w14="http://schemas.microsoft.com/office/word/2010/wordml" xmlns:w15="http://schemas.microsoft.com/office/word/2012/wordml" xmlns:w16cex="http://schemas.microsoft.com/office/word/2018/wordml/cex" xmlns:w16cid="http://schemas.microsoft.com/office/word/2016/wordml/cid" xmlns:w16="http://schemas.microsoft.com/office/word/2018/wordml" xmlns:w16du="http://schemas.microsoft.com/office/word/2023/wordml/word16du" xmlns:w16sdtdh="http://schemas.microsoft.com/office/word/2020/wordml/sdtdatahash" xmlns:w16sdtfl="http://schemas.microsoft.com/office/word/2024/wordml/sdtformatlock" xmlns:w16se="http://schemas.microsoft.com/office/word/2015/wordml/symex" xmlns:wpg="http://schemas.microsoft.com/office/word/2010/wordprocessingGroup" xmlns:wpi="http://schemas.microsoft.com/office/word/2010/wordprocessingInk" xmlns:wne="http://schemas.microsoft.com/office/word/2006/wordml" xmlns:wps="http://schemas.microsoft.com/office/word/2010/wordprocessingShape" mc:Ignorable="w14 w15 w16se w16cid w16 w16cex w16sdtdh w16sdtfl w16du wp14">
+  <w:abstractNum w:abstractNumId="0" w15:restartNumberingAfterBreak="0">
+    <w:nsid w:val="2B0F2C2E"/>
+    <w:multiLevelType w:val="hybridMultilevel"/>
+    <w:tmpl w:val="E98C2D22"/>
+    <w:lvl w:ilvl="0" w:tplc="2BDC240A">
+      <w:start w:val="16"/>
+      <w:numFmt w:val="bullet"/>
+      <w:lvlText w:val="-"/>
+      <w:lvlJc w:val="left"/>
+      <w:pPr>
+        <w:ind w:left="720" w:hanging="360"/>
+      </w:pPr>
+      <w:rPr>
+        <w:rFonts w:ascii="Calibri" w:eastAsiaTheme="minorHAnsi" w:hAnsi="Calibri" w:cs="Calibri" w:hint="default"/>
+      </w:rPr>
+    </w:lvl>
+    <w:lvl w:ilvl="1" w:tplc="04090003" w:tentative="1">
+      <w:start w:val="1"/>
+      <w:numFmt w:val="bullet"/>
+      <w:lvlText w:val="o"/>
+      <w:lvlJc w:val="left"/>
+      <w:pPr>
+        <w:ind w:left="1440" w:hanging="360"/>
+      </w:pPr>
+      <w:rPr>
+        <w:rFonts w:ascii="Courier New" w:hAnsi="Courier New" w:cs="Courier New" w:hint="default"/>
+      </w:rPr>
+    </w:lvl>
+    <w:lvl w:ilvl="2" w:tplc="04090005" w:tentative="1">
+      <w:start w:val="1"/>
+      <w:numFmt w:val="bullet"/>
+      <w:lvlText w:val=""/>
+      <w:lvlJc w:val="left"/>
+      <w:pPr>
+        <w:ind w:left="2160" w:hanging="360"/>
+      </w:pPr>
+      <w:rPr>
+        <w:rFonts w:ascii="Wingdings" w:hAnsi="Wingdings" w:hint="default"/>
+      </w:rPr>
+    </w:lvl>
+    <w:lvl w:ilvl="3" w:tplc="04090001" w:tentative="1">
+      <w:start w:val="1"/>
+      <w:numFmt w:val="bullet"/>
+      <w:lvlText w:val=""/>
+      <w:lvlJc w:val="left"/>
+      <w:pPr>
+        <w:ind w:left="2880" w:hanging="360"/>
+      </w:pPr>
+      <w:rPr>
+        <w:rFonts w:ascii="Symbol" w:hAnsi="Symbol" w:hint="default"/>
+      </w:rPr>
+    </w:lvl>
+    <w:lvl w:ilvl="4" w:tplc="04090003" w:tentative="1">
+      <w:start w:val="1"/>
+      <w:numFmt w:val="bullet"/>
+      <w:lvlText w:val="o"/>
+      <w:lvlJc w:val="left"/>
+      <w:pPr>
+        <w:ind w:left="3600" w:hanging="360"/>
+      </w:pPr>
+      <w:rPr>
+        <w:rFonts w:ascii="Courier New" w:hAnsi="Courier New" w:cs="Courier New" w:hint="default"/>
+      </w:rPr>
+    </w:lvl>
+    <w:lvl w:ilvl="5" w:tplc="04090005" w:tentative="1">
+      <w:start w:val="1"/>
+      <w:numFmt w:val="bullet"/>
+      <w:lvlText w:val=""/>
+      <w:lvlJc w:val="left"/>
+      <w:pPr>
+        <w:ind w:left="4320" w:hanging="360"/>
+      </w:pPr>
+      <w:rPr>
+        <w:rFonts w:ascii="Wingdings" w:hAnsi="Wingdings" w:hint="default"/>
+      </w:rPr>
+    </w:lvl>
+    <w:lvl w:ilvl="6" w:tplc="04090001" w:tentative="1">
+      <w:start w:val="1"/>
+      <w:numFmt w:val="bullet"/>
+      <w:lvlText w:val=""/>
+      <w:lvlJc w:val="left"/>
+      <w:pPr>
+        <w:ind w:left="5040" w:hanging="360"/>
+      </w:pPr>
+      <w:rPr>
+        <w:rFonts w:ascii="Symbol" w:hAnsi="Symbol" w:hint="default"/>
+      </w:rPr>
+    </w:lvl>
+    <w:lvl w:ilvl="7" w:tplc="04090003" w:tentative="1">
+      <w:start w:val="1"/>
+      <w:numFmt w:val="bullet"/>
+      <w:lvlText w:val="o"/>
+      <w:lvlJc w:val="left"/>
+      <w:pPr>
+        <w:ind w:left="5760" w:hanging="360"/>
+      </w:pPr>
+      <w:rPr>
+        <w:rFonts w:ascii="Courier New" w:hAnsi="Courier New" w:cs="Courier New" w:hint="default"/>
+      </w:rPr>
+    </w:lvl>
+    <w:lvl w:ilvl="8" w:tplc="04090005" w:tentative="1">
+      <w:start w:val="1"/>
+      <w:numFmt w:val="bullet"/>
+      <w:lvlText w:val=""/>
+      <w:lvlJc w:val="left"/>
+      <w:pPr>
+        <w:ind w:left="6480" w:hanging="360"/>
+      </w:pPr>
+      <w:rPr>
+        <w:rFonts w:ascii="Wingdings" w:hAnsi="Wingdings" w:hint="default"/>
+      </w:rPr>
+    </w:lvl>
+  </w:abstractNum>
+  <w:num w:numId="1" w16cid:durableId="2125735248">
+    <w:abstractNumId w:val="0"/>
+  </w:num>
+</w:numbering>
+</file>
+
 <file path=word/styles.xml><?xml version="1.0" encoding="utf-8"?>
-<w:styles xmlns:mc="http://schemas.openxmlformats.org/markup-compatibility/2006" xmlns:r="http://schemas.openxmlformats.org/officeDocument/2006/relationships" xmlns:w="http://schemas.openxmlformats.org/wordprocessingml/2006/main" xmlns:w14="http://schemas.microsoft.com/office/word/2010/wordml" xmlns:w15="http://schemas.microsoft.com/office/word/2012/wordml" xmlns:w16cex="http://schemas.microsoft.com/office/word/2018/wordml/cex" xmlns:w16cid="http://schemas.microsoft.com/office/word/2016/wordml/cid" xmlns:w16="http://schemas.microsoft.com/office/word/2018/wordml" xmlns:w16du="http://schemas.microsoft.com/office/word/2023/wordml/word16du" xmlns:w16sdtdh="http://schemas.microsoft.com/office/word/2020/wordml/sdtdatahash" xmlns:w16se="http://schemas.microsoft.com/office/word/2015/wordml/symex" mc:Ignorable="w14 w15 w16se w16cid w16 w16cex w16sdtdh w16du">
+<w:styles xmlns:mc="http://schemas.openxmlformats.org/markup-compatibility/2006" xmlns:r="http://schemas.openxmlformats.org/officeDocument/2006/relationships" xmlns:w="http://schemas.openxmlformats.org/wordprocessingml/2006/main" xmlns:w14="http://schemas.microsoft.com/office/word/2010/wordml" xmlns:w15="http://schemas.microsoft.com/office/word/2012/wordml" xmlns:w16cex="http://schemas.microsoft.com/office/word/2018/wordml/cex" xmlns:w16cid="http://schemas.microsoft.com/office/word/2016/wordml/cid" xmlns:w16="http://schemas.microsoft.com/office/word/2018/wordml" xmlns:w16du="http://schemas.microsoft.com/office/word/2023/wordml/word16du" xmlns:w16sdtdh="http://schemas.microsoft.com/office/word/2020/wordml/sdtdatahash" xmlns:w16sdtfl="http://schemas.microsoft.com/office/word/2024/wordml/sdtformatlock" xmlns:w16se="http://schemas.microsoft.com/office/word/2015/wordml/symex" mc:Ignorable="w14 w15 w16se w16cid w16 w16cex w16sdtdh w16sdtfl w16du">
   <w:docDefaults>
     <w:rPrDefault>
       <w:rPr>
@@ -695,6 +989,17 @@
       <w:shd w:val="clear" w:color="auto" w:fill="E1DFDD"/>
     </w:rPr>
   </w:style>
+  <w:style w:type="paragraph" w:styleId="ListParagraph">
+    <w:name w:val="List Paragraph"/>
+    <w:basedOn w:val="Normal"/>
+    <w:uiPriority w:val="34"/>
+    <w:qFormat/>
+    <w:rsid w:val="00B5746B"/>
+    <w:pPr>
+      <w:ind w:left="720"/>
+      <w:contextualSpacing/>
+    </w:pPr>
+  </w:style>
 </w:styles>
 </file>
 

</xml_diff>